<commit_message>
Update BiblicaStudyNotesKeyTerms for 2026-09-18 release
</commit_message>
<xml_diff>
--- a/arb/docx/001.content.docx
+++ b/arb/docx/001.content.docx
@@ -9,6 +9,8 @@
       </w:pPr>
       <w:r>
         <w:rPr>
+          <w:rtl/>
+          <w:cs/>
           <w:lang w:val="ar_AE" w:bidi="ar_AE"/>
         </w:rPr>
       </w:r>
@@ -20,12 +22,16 @@
       </w:pPr>
       <w:r>
         <w:rPr>
+          <w:rtl/>
+          <w:cs/>
           <w:lang w:val="ar_AE" w:bidi="ar_AE"/>
         </w:rPr>
         <w:t>Resource: Biblica Bible Dictionary</w:t>
       </w:r>
       <w:r>
         <w:rPr>
+          <w:rtl/>
+          <w:cs/>
           <w:lang w:val="ar_AE" w:bidi="ar_AE"/>
         </w:rPr>
       </w:r>
@@ -36,36 +42,48 @@
       </w:pPr>
       <w:r>
         <w:rPr>
+          <w:rtl/>
+          <w:cs/>
           <w:lang w:val="ar_AE" w:bidi="ar_AE"/>
         </w:rPr>
       </w:r>
       <w:r>
         <w:rPr>
           <w:b/>
+          <w:rtl/>
+          <w:cs/>
           <w:lang w:val="ar_AE" w:bidi="ar_AE"/>
         </w:rPr>
         <w:t>Biblica Study Notes (Key Terms)</w:t>
       </w:r>
       <w:r>
         <w:rPr>
+          <w:rtl/>
+          <w:cs/>
           <w:lang w:val="ar_AE" w:bidi="ar_AE"/>
         </w:rPr>
         <w:t xml:space="preserve"> © 2023 Biblica Inc. Released under CC BY-SA 4.0 license. </w:t>
       </w:r>
       <w:r>
         <w:rPr>
+          <w:rtl/>
+          <w:cs/>
           <w:lang w:val="ar_AE" w:bidi="ar_AE"/>
         </w:rPr>
         <w:t>Biblica Study Notes</w:t>
       </w:r>
       <w:r>
         <w:rPr>
+          <w:rtl/>
+          <w:cs/>
           <w:lang w:val="ar_AE" w:bidi="ar_AE"/>
         </w:rPr>
         <w:t xml:space="preserve"> has been adapted in the following languages: Tok Pisin, Arabic (عربي), French (Français), Hindi (हिंदी), Indonesian (Bahasa Indonesia), Portuguese (Português), Russian (Русский), Spanish (Español), Swahili (Kiswahili), and Simplified Chinese (简体中文)from Biblica Study Notes © 2023 Biblica Inc. Released under CC BY-SA 4.0 license by Mission Mutual.</w:t>
       </w:r>
       <w:r>
         <w:rPr>
+          <w:rtl/>
+          <w:cs/>
           <w:lang w:val="ar_AE" w:bidi="ar_AE"/>
         </w:rPr>
       </w:r>
@@ -77,6 +95,8 @@
       </w:pPr>
       <w:r>
         <w:rPr>
+          <w:rtl/>
+          <w:cs/>
           <w:lang w:val="ar_AE" w:bidi="ar_AE"/>
         </w:rPr>
         <w:t>Biblica Bible Dictionary</w:t>
@@ -106,6 +126,8 @@
       </w:pPr>
       <w:r>
         <w:rPr>
+          <w:rtl/>
+          <w:cs/>
           <w:lang w:val="ar_AE" w:bidi="ar_AE"/>
         </w:rPr>
       </w:r>
@@ -117,12 +139,16 @@
       </w:pPr>
       <w:r>
         <w:rPr>
+          <w:rtl/>
+          <w:cs/>
           <w:lang w:val="ar_AE" w:bidi="ar_AE"/>
         </w:rPr>
         <w:t>null</w:t>
       </w:r>
       <w:r>
         <w:rPr>
+          <w:rtl/>
+          <w:cs/>
           <w:lang w:val="ar_AE" w:bidi="ar_AE"/>
         </w:rPr>
       </w:r>
@@ -133,22 +159,30 @@
       </w:pPr>
       <w:r>
         <w:rPr>
+          <w:rtl/>
+          <w:cs/>
           <w:lang w:val="ar_AE" w:bidi="ar_AE"/>
         </w:rPr>
       </w:r>
       <w:r>
         <w:rPr>
+          <w:rtl/>
+          <w:cs/>
           <w:lang w:val="ar_AE" w:bidi="ar_AE"/>
         </w:rPr>
         <w:t xml:space="preserve"> </w:t>
       </w:r>
       <w:r>
         <w:rPr>
+          <w:rtl/>
+          <w:cs/>
           <w:lang w:val="ar_AE" w:bidi="ar_AE"/>
         </w:rPr>
       </w:r>
       <w:r>
         <w:rPr>
+          <w:rtl/>
+          <w:cs/>
           <w:lang w:val="ar_AE" w:bidi="ar_AE"/>
         </w:rPr>
       </w:r>
@@ -174,6 +208,8 @@
       </w:pPr>
       <w:r>
         <w:rPr>
+          <w:rtl/>
+          <w:cs/>
           <w:lang w:val="ar_AE" w:bidi="ar_AE"/>
         </w:rPr>
       </w:r>
@@ -185,12 +221,16 @@
       </w:pPr>
       <w:r>
         <w:rPr>
+          <w:rtl/>
+          <w:cs/>
           <w:lang w:val="ar_AE" w:bidi="ar_AE"/>
         </w:rPr>
         <w:t>١٠٠٠ سنة</w:t>
       </w:r>
       <w:r>
         <w:rPr>
+          <w:rtl/>
+          <w:cs/>
           <w:lang w:val="ar_AE" w:bidi="ar_AE"/>
         </w:rPr>
       </w:r>
@@ -201,22 +241,30 @@
       </w:pPr>
       <w:r>
         <w:rPr>
+          <w:rtl/>
+          <w:cs/>
           <w:lang w:val="ar_AE" w:bidi="ar_AE"/>
         </w:rPr>
       </w:r>
       <w:r>
         <w:rPr>
+          <w:rtl/>
+          <w:cs/>
           <w:lang w:val="ar_AE" w:bidi="ar_AE"/>
         </w:rPr>
         <w:t>في إحدى الرؤى، رأى يوحنا الرائي أن الشيطان مُقَيَِدًا في الهاوية لمدة 1000 سنة. كما رأى يوحنا أيضًا أن المسيح سيحكم لمدة 1000 سنة. وسحكم معه بعض أتباعه الذين قُتلوا مِن أجل شَهَادة يسوع. يعتقد بعض الناس أن هذه الأشياء ستحدث تمامًا كما رآها يوحنا في الرؤية. ويعتقد آخرون أن هذه الأشياء هي علامات. إنها علامات على أن الله سيأتي بالدينونة على الشر ويأتي بملكوته إلى الأرض.</w:t>
       </w:r>
       <w:r>
         <w:rPr>
+          <w:rtl/>
+          <w:cs/>
           <w:lang w:val="ar_AE" w:bidi="ar_AE"/>
         </w:rPr>
       </w:r>
       <w:r>
         <w:rPr>
+          <w:rtl/>
+          <w:cs/>
           <w:lang w:val="ar_AE" w:bidi="ar_AE"/>
         </w:rPr>
       </w:r>
@@ -227,6 +275,8 @@
       </w:pPr>
       <w:r>
         <w:rPr>
+          <w:rtl/>
+          <w:cs/>
           <w:lang w:val="ar_AE" w:bidi="ar_AE"/>
         </w:rPr>
       </w:r>
@@ -238,12 +288,16 @@
       </w:pPr>
       <w:r>
         <w:rPr>
+          <w:rtl/>
+          <w:cs/>
           <w:lang w:val="ar_AE" w:bidi="ar_AE"/>
         </w:rPr>
         <w:t>666</w:t>
       </w:r>
       <w:r>
         <w:rPr>
+          <w:rtl/>
+          <w:cs/>
           <w:lang w:val="ar_AE" w:bidi="ar_AE"/>
         </w:rPr>
       </w:r>
@@ -254,22 +308,30 @@
       </w:pPr>
       <w:r>
         <w:rPr>
+          <w:rtl/>
+          <w:cs/>
           <w:lang w:val="ar_AE" w:bidi="ar_AE"/>
         </w:rPr>
       </w:r>
       <w:r>
         <w:rPr>
+          <w:rtl/>
+          <w:cs/>
           <w:lang w:val="ar_AE" w:bidi="ar_AE"/>
         </w:rPr>
         <w:t>رقم الوحش الخارج من البحر في رؤية يوحنا. لا يوجد شيء سحري أو شرير في الرقم 666. الرقم 666 هو علامة. إنه علامة لإنسان أو حكومة تسعى إلى سلطة كاملة وشاملة. يدّعون أنهم أقوياء مثل الله. يزعمون أيضًا أنهم يستحقون أن يُعبدوا مثل الله.</w:t>
       </w:r>
       <w:r>
         <w:rPr>
+          <w:rtl/>
+          <w:cs/>
           <w:lang w:val="ar_AE" w:bidi="ar_AE"/>
         </w:rPr>
       </w:r>
       <w:r>
         <w:rPr>
+          <w:rtl/>
+          <w:cs/>
           <w:lang w:val="ar_AE" w:bidi="ar_AE"/>
         </w:rPr>
       </w:r>

</xml_diff>